<commit_message>
Documents for the midterm exam
</commit_message>
<xml_diff>
--- a/docs/requirements/EventKu_2_SRS.docx
+++ b/docs/requirements/EventKu_2_SRS.docx
@@ -1342,7 +1342,7 @@
         <w:spacing w:after="120" w:line="276"/>
       </w:pPr>
       <w:r>
-        <w:t xml:space="preserve">EventKu adalah sistem mandiri berbasis web dengan arsitektur klien–server: frontend (React.js + Tailwind CSS) berkomunikasi dengan backend melalui REST API, dan backend menyimpan data pada basis data relasional (MySQL/PostgreSQL). Sistem dirancang modular dengan modul Auth, Event, Pendaftaran, dan Notifikasi.</w:t>
+        <w:t xml:space="preserve">EventKu adalah sistem mandiri berbasis web dengan arsitektur klien–server: frontend (React.js + Tailwind CSS) berkomunikasi dengan backend melalui REST API, dan backend menyimpan data pada basis data relasional (PostgreSQL). Sistem dirancang modular dengan modul Auth, Event, Pendaftaran, dan Notifikasi.</w:t>
       </w:r>
     </w:p>
     <w:p>
@@ -2034,7 +2034,7 @@
         <w:spacing w:after="60" w:line="276"/>
       </w:pPr>
       <w:r>
-        <w:t xml:space="preserve">Basis data relasional (MySQL atau PostgreSQL).</w:t>
+        <w:t xml:space="preserve">Basis data relasional (PostgreSQL).</w:t>
       </w:r>
     </w:p>
     <w:p>

</xml_diff>